<commit_message>
Prepare accepted-manuscript code and documentation
</commit_message>
<xml_diff>
--- a/Recurrent_network/code_dales_law_rnn_low_rank/readme.docx
+++ b/Recurrent_network/code_dales_law_rnn_low_rank/readme.docx
@@ -4,112 +4,92 @@
   <w:body>
     <w:p>
       <w:pPr>
-        <w:jc w:val="center"/>
-        <w:rPr>
-          <w:b/>
-          <w:bCs/>
-        </w:rPr>
+        <w:pStyle w:val="Title"/>
       </w:pPr>
       <w:r>
-        <w:rPr>
-          <w:b/>
-          <w:bCs/>
-        </w:rPr>
-        <w:t xml:space="preserve">Bias Learning </w:t>
-      </w:r>
-    </w:p>
-    <w:p>
-      <w:r>
-        <w:t xml:space="preserve">The function </w:t>
-      </w:r>
-      <w:proofErr w:type="spellStart"/>
-      <w:r>
-        <w:t>rnn_learning.m</w:t>
-      </w:r>
-      <w:proofErr w:type="spellEnd"/>
-      <w:r>
-        <w:t xml:space="preserve"> will run bias learning with a single RNN configured with Dale’s Law in the synaptic weights.  The function </w:t>
-      </w:r>
-      <w:proofErr w:type="spellStart"/>
-      <w:r>
-        <w:t>bias_gradient</w:t>
-      </w:r>
-      <w:proofErr w:type="spellEnd"/>
-      <w:r>
-        <w:t xml:space="preserve"> </w:t>
-      </w:r>
-      <w:proofErr w:type="spellStart"/>
-      <w:r>
-        <w:t>descent.m</w:t>
-      </w:r>
-      <w:proofErr w:type="spellEnd"/>
-      <w:r>
-        <w:t xml:space="preserve"> performs gradient descent for the target dynamical system, while </w:t>
-      </w:r>
-      <w:proofErr w:type="spellStart"/>
-      <w:r>
-        <w:t>int_dyn</w:t>
-      </w:r>
-      <w:proofErr w:type="spellEnd"/>
-      <w:r>
-        <w:t xml:space="preserve"> integrates the 40 different dynamical systems considered.  </w:t>
-      </w:r>
-      <w:proofErr w:type="spellStart"/>
-      <w:r>
-        <w:t>net_int</w:t>
-      </w:r>
-      <w:proofErr w:type="spellEnd"/>
-      <w:r>
-        <w:t xml:space="preserve"> integrates the low-rank RNN, while </w:t>
-      </w:r>
-      <w:proofErr w:type="spellStart"/>
-      <w:r>
-        <w:t>net_int_large</w:t>
-      </w:r>
-      <w:proofErr w:type="spellEnd"/>
-      <w:r>
-        <w:t xml:space="preserve"> integrates the network in a full neuronal configuration (all N neurons are simulated).   </w:t>
-      </w:r>
-      <w:r>
-        <w:t xml:space="preserve">  The core function to initially run is </w:t>
-      </w:r>
-      <w:proofErr w:type="spellStart"/>
-      <w:r>
-        <w:t>rnn_learning.m</w:t>
-      </w:r>
-      <w:proofErr w:type="spellEnd"/>
-      <w:r>
-        <w:t xml:space="preserve"> first, as it automatically calls </w:t>
-      </w:r>
-      <w:proofErr w:type="spellStart"/>
-      <w:r>
-        <w:t>net_config</w:t>
-      </w:r>
-      <w:proofErr w:type="spellEnd"/>
-      <w:r>
-        <w:t>.</w:t>
-      </w:r>
-      <w:r>
-        <w:t xml:space="preserve">  The MATLAB script </w:t>
-      </w:r>
-      <w:proofErr w:type="spellStart"/>
-      <w:r>
-        <w:t>net_config</w:t>
-      </w:r>
-      <w:proofErr w:type="spellEnd"/>
-      <w:r>
-        <w:t xml:space="preserve"> sets the network parameters. </w:t>
-      </w:r>
-    </w:p>
-    <w:p>
-      <w:r>
-        <w:t>Note that training all 40 dynamical systems can take a lengthy period of time.  All results are saved independently for each system as a .mat file, along with screen shots of the final training performance, and the network output during a testing regime.</w:t>
-      </w:r>
-      <w:r>
-        <w:t xml:space="preserve">  </w:t>
-      </w:r>
-      <w:r>
-        <w:t xml:space="preserve"> </w:t>
+        <w:t>Low-Rank Recurrent BANFF Experiments</w:t>
+      </w:r>
+    </w:p>
+    <w:p>
+      <w:r>
+        <w:t>This folder contains the recurrent MATLAB implementation associated with the manuscript. Only task-specific neuronal biases are trained; the encoder, decoder, and recurrent scaffold remain fixed.</w:t>
+      </w:r>
+    </w:p>
+    <w:p>
+      <w:pPr>
+        <w:pStyle w:val="Heading1"/>
+      </w:pPr>
+      <w:r>
+        <w:t>Standard multisystem experiment</w:t>
+      </w:r>
+    </w:p>
+    <w:p>
+      <w:r>
+        <w:t>Run rnn_learning.m for the standard mixed-sign low-rank recurrent network. It calls net_config.m and trains the first 40 spreadsheet systems by default. This standard script is not Dale-constrained.</w:t>
+      </w:r>
+    </w:p>
+    <w:p>
+      <w:pPr>
+        <w:pStyle w:val="Heading1"/>
+      </w:pPr>
+      <w:r>
+        <w:t>Dale-constrained experiment</w:t>
+      </w:r>
+    </w:p>
+    <w:p>
+      <w:r>
+        <w:t>Run rnn_learning_dales_law.m for the separate Dale-constrained experiment. It calls net_config_dales_law.m and uses the six system rows exposed by SYSTEM_ROWS.</w:t>
+      </w:r>
+    </w:p>
+    <w:p>
+      <w:pPr>
+        <w:pStyle w:val="Heading1"/>
+      </w:pPr>
+      <w:r>
+        <w:t>Other experiments</w:t>
+      </w:r>
+    </w:p>
+    <w:p>
+      <w:r>
+        <w:t>Run rnn_lorenz_bias_ensemble.m for the multiple-Lorenz-bias, switching, and rapid-switching protocols.</w:t>
+      </w:r>
+    </w:p>
+    <w:p>
+      <w:pPr>
+        <w:pStyle w:val="Heading1"/>
+      </w:pPr>
+      <w:r>
+        <w:t>Core source files</w:t>
+      </w:r>
+    </w:p>
+    <w:p>
+      <w:r>
+        <w:t>- bias_gradient_descent.m: bias-only gradient descent with momentum.</w:t>
+      </w:r>
+    </w:p>
+    <w:p>
+      <w:r>
+        <w:t>- net_int.m: decoded low-rank network ODE right-hand side.</w:t>
+      </w:r>
+    </w:p>
+    <w:p>
+      <w:r>
+        <w:t>- net_int_large.m: full recurrent-state ODE helper.</w:t>
+      </w:r>
+    </w:p>
+    <w:p>
+      <w:r>
+        <w:t>- int_dyn.m: target-system vector fields.</w:t>
+      </w:r>
+    </w:p>
+    <w:p>
+      <w:r>
+        <w:t>- dynamics_list.xlsx: system labels, dimensions, initial conditions, and scaling flags.</w:t>
+      </w:r>
+    </w:p>
+    <w:p>
+      <w:r>
+        <w:t>See README.md in this folder for the authoritative run order, hyperparameters, outputs, and reproducibility notes.</w:t>
       </w:r>
     </w:p>
     <w:sectPr>
@@ -522,6 +502,10 @@
   <w:style w:type="paragraph" w:default="1" w:styleId="Normal">
     <w:name w:val="Normal"/>
     <w:qFormat/>
+    <w:rPr>
+      <w:rFonts w:ascii="Arial" w:hAnsi="Arial"/>
+      <w:sz w:val="20"/>
+    </w:rPr>
   </w:style>
   <w:style w:type="paragraph" w:styleId="Heading1">
     <w:name w:val="heading 1"/>

</xml_diff>